<commit_message>
Merged PR 1233: feat(ui:print) add functional zones to plot_conclusion
Related work items: #4175, #4176
</commit_message>
<xml_diff>
--- a/report-service/src/main/resources/system_templates/sys_plot_conclusion.docx
+++ b/report-service/src/main/resources/system_templates/sys_plot_conclusion.docx
@@ -1958,7 +1958,7 @@
         <w:keepNext/>
       </w:pPr>
       <w:r>
-        <w:t xml:space="preserve">Сведения, из Единого государственного реестра недвижимости о земельном участке, указанные в данном разделе, являются актуальными на дату </w:t>
+        <w:t xml:space="preserve">Сведения, из Единого государственного реестра недвижимости о земельном участке, указанные в данном разделе, являются актуальными на </w:t>
       </w:r>
       <w:r>
         <w:rPr>
@@ -4053,6 +4053,692 @@
       <w:proofErr w:type="gramEnd"/>
       <w:r>
         <w:t xml:space="preserve">, указанные в данном разделе, являются актуальными на дату </w:t>
+      </w:r>
+      <w:r>
+        <w:rPr>
+          <w:noProof/>
+        </w:rPr>
+        <w:t>{</w:t>
+      </w:r>
+      <w:r>
+        <w:rPr>
+          <w:noProof/>
+          <w:lang w:val="en-US"/>
+        </w:rPr>
+        <w:t>d</w:t>
+      </w:r>
+      <w:r>
+        <w:rPr>
+          <w:noProof/>
+        </w:rPr>
+        <w:t>.</w:t>
+      </w:r>
+      <w:r>
+        <w:rPr>
+          <w:noProof/>
+          <w:lang w:val="en-US"/>
+        </w:rPr>
+        <w:t>dataDate</w:t>
+      </w:r>
+      <w:r>
+        <w:rPr>
+          <w:noProof/>
+        </w:rPr>
+        <w:t>:</w:t>
+      </w:r>
+      <w:r>
+        <w:rPr>
+          <w:noProof/>
+          <w:lang w:val="en-US"/>
+        </w:rPr>
+        <w:t>formatD</w:t>
+      </w:r>
+      <w:r>
+        <w:rPr>
+          <w:noProof/>
+        </w:rPr>
+        <w:t>('</w:t>
+      </w:r>
+      <w:r>
+        <w:rPr>
+          <w:noProof/>
+          <w:lang w:val="en-US"/>
+        </w:rPr>
+        <w:t>LL</w:t>
+      </w:r>
+      <w:r>
+        <w:rPr>
+          <w:noProof/>
+        </w:rPr>
+        <w:t>')}</w:t>
+      </w:r>
+      <w:r>
+        <w:br w:type="page"/>
+      </w:r>
+    </w:p>
+    <w:p>
+      <w:pPr>
+        <w:pStyle w:val="a4"/>
+      </w:pPr>
+      <w:r>
+        <w:lastRenderedPageBreak/>
+        <w:t>Сведения о расположении участка в функциональных зонах</w:t>
+      </w:r>
+    </w:p>
+    <w:p>
+      <w:pPr>
+        <w:pStyle w:val="a6"/>
+        <w:rPr>
+          <w:lang w:val="en-US"/>
+        </w:rPr>
+      </w:pPr>
+      <w:r>
+        <w:rPr>
+          <w:lang w:val="en-US"/>
+        </w:rPr>
+        <w:t>{</w:t>
+      </w:r>
+      <w:proofErr w:type="spellStart"/>
+      <w:proofErr w:type="gramStart"/>
+      <w:r>
+        <w:rPr>
+          <w:lang w:val="en-US"/>
+        </w:rPr>
+        <w:t>d.</w:t>
+      </w:r>
+      <w:r>
+        <w:rPr>
+          <w:lang w:val="en-US"/>
+        </w:rPr>
+        <w:t>fz</w:t>
+      </w:r>
+      <w:proofErr w:type="spellEnd"/>
+      <w:proofErr w:type="gramEnd"/>
+      <w:r>
+        <w:rPr>
+          <w:lang w:val="en-US"/>
+        </w:rPr>
+        <w:t>[</w:t>
+      </w:r>
+      <w:proofErr w:type="spellStart"/>
+      <w:r>
+        <w:rPr>
+          <w:lang w:val="en-US"/>
+        </w:rPr>
+        <w:t>i</w:t>
+      </w:r>
+      <w:proofErr w:type="spellEnd"/>
+      <w:proofErr w:type="gramStart"/>
+      <w:r>
+        <w:rPr>
+          <w:lang w:val="en-US"/>
+        </w:rPr>
+        <w:t>].</w:t>
+      </w:r>
+      <w:proofErr w:type="spellStart"/>
+      <w:r>
+        <w:rPr>
+          <w:lang w:val="en-US"/>
+        </w:rPr>
+        <w:t>classidReadable</w:t>
+      </w:r>
+      <w:proofErr w:type="gramEnd"/>
+      <w:r>
+        <w:rPr>
+          <w:lang w:val="en-US"/>
+        </w:rPr>
+        <w:t>:print</w:t>
+      </w:r>
+      <w:proofErr w:type="spellEnd"/>
+      <w:proofErr w:type="gramStart"/>
+      <w:r>
+        <w:rPr>
+          <w:lang w:val="en-US"/>
+        </w:rPr>
+        <w:t>(.</w:t>
+      </w:r>
+      <w:proofErr w:type="spellStart"/>
+      <w:r>
+        <w:rPr>
+          <w:lang w:val="en-US"/>
+        </w:rPr>
+        <w:t>i</w:t>
+      </w:r>
+      <w:proofErr w:type="spellEnd"/>
+      <w:r>
+        <w:rPr>
+          <w:lang w:val="en-US"/>
+        </w:rPr>
+        <w:t>):add</w:t>
+      </w:r>
+      <w:proofErr w:type="gramEnd"/>
+      <w:r>
+        <w:rPr>
+          <w:lang w:val="en-US"/>
+        </w:rPr>
+        <w:t>(1)</w:t>
+      </w:r>
+      <w:r>
+        <w:rPr>
+          <w:lang w:val="en-US"/>
+        </w:rPr>
+        <w:t>}. {</w:t>
+      </w:r>
+      <w:proofErr w:type="spellStart"/>
+      <w:proofErr w:type="gramStart"/>
+      <w:r>
+        <w:rPr>
+          <w:lang w:val="en-US"/>
+        </w:rPr>
+        <w:t>d.</w:t>
+      </w:r>
+      <w:r>
+        <w:rPr>
+          <w:lang w:val="en-US"/>
+        </w:rPr>
+        <w:t>fz</w:t>
+      </w:r>
+      <w:proofErr w:type="spellEnd"/>
+      <w:proofErr w:type="gramEnd"/>
+      <w:r>
+        <w:rPr>
+          <w:lang w:val="en-US"/>
+        </w:rPr>
+        <w:t>[</w:t>
+      </w:r>
+      <w:proofErr w:type="spellStart"/>
+      <w:r>
+        <w:rPr>
+          <w:lang w:val="en-US"/>
+        </w:rPr>
+        <w:t>i</w:t>
+      </w:r>
+      <w:proofErr w:type="spellEnd"/>
+      <w:proofErr w:type="gramStart"/>
+      <w:r>
+        <w:rPr>
+          <w:lang w:val="en-US"/>
+        </w:rPr>
+        <w:t>].</w:t>
+      </w:r>
+      <w:proofErr w:type="spellStart"/>
+      <w:r>
+        <w:rPr>
+          <w:lang w:val="en-US"/>
+        </w:rPr>
+        <w:t>classidReadable</w:t>
+      </w:r>
+      <w:proofErr w:type="spellEnd"/>
+      <w:proofErr w:type="gramEnd"/>
+      <w:r>
+        <w:rPr>
+          <w:lang w:val="en-US"/>
+        </w:rPr>
+        <w:t>}</w:t>
+      </w:r>
+    </w:p>
+    <w:tbl>
+      <w:tblPr>
+        <w:tblStyle w:val="geo"/>
+        <w:tblW w:w="5000" w:type="pct"/>
+        <w:shd w:val="clear" w:color="auto" w:fill="FFFFFF"/>
+        <w:tblLayout w:type="fixed"/>
+        <w:tblCellMar>
+          <w:left w:w="113" w:type="dxa"/>
+          <w:right w:w="113" w:type="dxa"/>
+        </w:tblCellMar>
+        <w:tblLook w:val="0680" w:firstRow="0" w:lastRow="0" w:firstColumn="1" w:lastColumn="0" w:noHBand="1" w:noVBand="1"/>
+      </w:tblPr>
+      <w:tblGrid>
+        <w:gridCol w:w="5224"/>
+        <w:gridCol w:w="5031"/>
+      </w:tblGrid>
+      <w:tr>
+        <w:tc>
+          <w:tcPr>
+            <w:cnfStyle w:val="001000000000" w:firstRow="0" w:lastRow="0" w:firstColumn="1" w:lastColumn="0" w:oddVBand="0" w:evenVBand="0" w:oddHBand="0" w:evenHBand="0" w:firstRowFirstColumn="0" w:firstRowLastColumn="0" w:lastRowFirstColumn="0" w:lastRowLastColumn="0"/>
+            <w:tcW w:w="5224" w:type="dxa"/>
+          </w:tcPr>
+          <w:p>
+            <w:pPr>
+              <w:rPr>
+                <w:rStyle w:val="af4"/>
+              </w:rPr>
+            </w:pPr>
+            <w:r>
+              <w:rPr>
+                <w:rStyle w:val="af4"/>
+              </w:rPr>
+              <w:t>Статус</w:t>
+            </w:r>
+            <w:r>
+              <w:rPr>
+                <w:rStyle w:val="af4"/>
+              </w:rPr>
+              <w:t xml:space="preserve"> зоны</w:t>
+            </w:r>
+          </w:p>
+        </w:tc>
+        <w:tc>
+          <w:tcPr>
+            <w:tcW w:w="5031" w:type="dxa"/>
+          </w:tcPr>
+          <w:p>
+            <w:pPr>
+              <w:cnfStyle w:val="000000000000" w:firstRow="0" w:lastRow="0" w:firstColumn="0" w:lastColumn="0" w:oddVBand="0" w:evenVBand="0" w:oddHBand="0" w:evenHBand="0" w:firstRowFirstColumn="0" w:firstRowLastColumn="0" w:lastRowFirstColumn="0" w:lastRowLastColumn="0"/>
+              <w:rPr>
+                <w:lang w:val="en-US"/>
+              </w:rPr>
+            </w:pPr>
+            <w:r>
+              <w:rPr>
+                <w:lang w:val="en-US"/>
+              </w:rPr>
+              <w:t>{</w:t>
+            </w:r>
+            <w:proofErr w:type="spellStart"/>
+            <w:proofErr w:type="gramStart"/>
+            <w:r>
+              <w:rPr>
+                <w:lang w:val="en-US"/>
+              </w:rPr>
+              <w:t>d.</w:t>
+            </w:r>
+            <w:r>
+              <w:rPr>
+                <w:lang w:val="en-US"/>
+              </w:rPr>
+              <w:t>fz</w:t>
+            </w:r>
+            <w:proofErr w:type="spellEnd"/>
+            <w:proofErr w:type="gramEnd"/>
+            <w:r>
+              <w:rPr>
+                <w:lang w:val="en-US"/>
+              </w:rPr>
+              <w:t>[</w:t>
+            </w:r>
+            <w:proofErr w:type="spellStart"/>
+            <w:r>
+              <w:rPr>
+                <w:lang w:val="en-US"/>
+              </w:rPr>
+              <w:t>i</w:t>
+            </w:r>
+            <w:proofErr w:type="spellEnd"/>
+            <w:proofErr w:type="gramStart"/>
+            <w:r>
+              <w:rPr>
+                <w:lang w:val="en-US"/>
+              </w:rPr>
+              <w:t>].</w:t>
+            </w:r>
+            <w:proofErr w:type="spellStart"/>
+            <w:r>
+              <w:rPr>
+                <w:lang w:val="en-US"/>
+              </w:rPr>
+              <w:t>statusReadable</w:t>
+            </w:r>
+            <w:proofErr w:type="spellEnd"/>
+            <w:proofErr w:type="gramEnd"/>
+            <w:r>
+              <w:rPr>
+                <w:lang w:val="en-US"/>
+              </w:rPr>
+              <w:t>}</w:t>
+            </w:r>
+          </w:p>
+        </w:tc>
+      </w:tr>
+      <w:tr>
+        <w:tc>
+          <w:tcPr>
+            <w:cnfStyle w:val="001000000000" w:firstRow="0" w:lastRow="0" w:firstColumn="1" w:lastColumn="0" w:oddVBand="0" w:evenVBand="0" w:oddHBand="0" w:evenHBand="0" w:firstRowFirstColumn="0" w:firstRowLastColumn="0" w:lastRowFirstColumn="0" w:lastRowLastColumn="0"/>
+            <w:tcW w:w="5224" w:type="dxa"/>
+          </w:tcPr>
+          <w:p>
+            <w:pPr>
+              <w:rPr>
+                <w:rStyle w:val="af4"/>
+              </w:rPr>
+            </w:pPr>
+            <w:r>
+              <w:rPr>
+                <w:rStyle w:val="af4"/>
+              </w:rPr>
+              <w:t>Площадь пересечения с объектом недвижимости</w:t>
+            </w:r>
+          </w:p>
+        </w:tc>
+        <w:tc>
+          <w:tcPr>
+            <w:tcW w:w="5031" w:type="dxa"/>
+          </w:tcPr>
+          <w:p>
+            <w:pPr>
+              <w:cnfStyle w:val="000000000000" w:firstRow="0" w:lastRow="0" w:firstColumn="0" w:lastColumn="0" w:oddVBand="0" w:evenVBand="0" w:oddHBand="0" w:evenHBand="0" w:firstRowFirstColumn="0" w:firstRowLastColumn="0" w:lastRowFirstColumn="0" w:lastRowLastColumn="0"/>
+              <w:rPr>
+                <w:noProof/>
+                <w:lang w:val="en-US"/>
+              </w:rPr>
+            </w:pPr>
+            <w:r>
+              <w:rPr>
+                <w:noProof/>
+                <w:lang w:val="en-US"/>
+              </w:rPr>
+              <w:t>{</w:t>
+            </w:r>
+            <w:proofErr w:type="gramStart"/>
+            <w:r>
+              <w:rPr>
+                <w:noProof/>
+                <w:lang w:val="en-US"/>
+              </w:rPr>
+              <w:t>d.</w:t>
+            </w:r>
+            <w:r>
+              <w:rPr>
+                <w:lang w:val="en-US"/>
+              </w:rPr>
+              <w:t>fz</w:t>
+            </w:r>
+            <w:proofErr w:type="gramEnd"/>
+            <w:r>
+              <w:rPr>
+                <w:noProof/>
+                <w:lang w:val="en-US"/>
+              </w:rPr>
+              <w:t>[</w:t>
+            </w:r>
+            <w:proofErr w:type="spellStart"/>
+            <w:r>
+              <w:rPr>
+                <w:noProof/>
+                <w:lang w:val="en-US"/>
+              </w:rPr>
+              <w:t>i</w:t>
+            </w:r>
+            <w:proofErr w:type="spellEnd"/>
+            <w:r>
+              <w:rPr>
+                <w:noProof/>
+                <w:lang w:val="en-US"/>
+              </w:rPr>
+              <w:t>].</w:t>
+            </w:r>
+            <w:r>
+              <w:rPr>
+                <w:noProof/>
+                <w:lang w:val="en-US"/>
+              </w:rPr>
+              <w:t>intersectionArea</w:t>
+            </w:r>
+            <w:r>
+              <w:rPr>
+                <w:noProof/>
+                <w:lang w:val="en-US"/>
+              </w:rPr>
+              <w:t>}</w:t>
+            </w:r>
+            <w:r>
+              <w:rPr>
+                <w:noProof/>
+                <w:lang w:val="en-US"/>
+              </w:rPr>
+              <w:t xml:space="preserve"> </w:t>
+            </w:r>
+            <w:r>
+              <w:rPr>
+                <w:noProof/>
+              </w:rPr>
+              <w:t>м</w:t>
+            </w:r>
+            <w:r>
+              <w:rPr>
+                <w:noProof/>
+                <w:vertAlign w:val="superscript"/>
+                <w:lang w:val="en-US"/>
+              </w:rPr>
+              <w:t>2</w:t>
+            </w:r>
+            <w:r>
+              <w:rPr>
+                <w:noProof/>
+                <w:lang w:val="en-US"/>
+              </w:rPr>
+              <w:t xml:space="preserve"> (</w:t>
+            </w:r>
+            <w:r>
+              <w:rPr>
+                <w:noProof/>
+                <w:lang w:val="en-US"/>
+              </w:rPr>
+              <w:t>{</w:t>
+            </w:r>
+            <w:proofErr w:type="gramStart"/>
+            <w:r>
+              <w:rPr>
+                <w:noProof/>
+                <w:lang w:val="en-US"/>
+              </w:rPr>
+              <w:t>d.</w:t>
+            </w:r>
+            <w:r>
+              <w:rPr>
+                <w:lang w:val="en-US"/>
+              </w:rPr>
+              <w:t>fz</w:t>
+            </w:r>
+            <w:proofErr w:type="gramEnd"/>
+            <w:r>
+              <w:rPr>
+                <w:noProof/>
+                <w:lang w:val="en-US"/>
+              </w:rPr>
+              <w:t>[</w:t>
+            </w:r>
+            <w:proofErr w:type="spellStart"/>
+            <w:r>
+              <w:rPr>
+                <w:noProof/>
+                <w:lang w:val="en-US"/>
+              </w:rPr>
+              <w:t>i</w:t>
+            </w:r>
+            <w:proofErr w:type="spellEnd"/>
+            <w:r>
+              <w:rPr>
+                <w:noProof/>
+                <w:lang w:val="en-US"/>
+              </w:rPr>
+              <w:t>].</w:t>
+            </w:r>
+            <w:r>
+              <w:rPr>
+                <w:noProof/>
+                <w:lang w:val="en-US"/>
+              </w:rPr>
+              <w:t>intersectionAreaPercent</w:t>
+            </w:r>
+            <w:r>
+              <w:rPr>
+                <w:noProof/>
+                <w:lang w:val="en-US"/>
+              </w:rPr>
+              <w:t>}</w:t>
+            </w:r>
+            <w:r>
+              <w:rPr>
+                <w:noProof/>
+                <w:lang w:val="en-US"/>
+              </w:rPr>
+              <w:t>%)</w:t>
+            </w:r>
+          </w:p>
+        </w:tc>
+      </w:tr>
+    </w:tbl>
+    <w:p>
+      <w:pPr>
+        <w:pStyle w:val="a6"/>
+      </w:pPr>
+      <w:r>
+        <w:t>{</w:t>
+      </w:r>
+      <w:proofErr w:type="gramStart"/>
+      <w:r>
+        <w:rPr>
+          <w:lang w:val="en-US"/>
+        </w:rPr>
+        <w:t>d</w:t>
+      </w:r>
+      <w:r>
+        <w:t>.</w:t>
+      </w:r>
+      <w:r>
+        <w:rPr>
+          <w:lang w:val="en-US"/>
+        </w:rPr>
+        <w:t>fz</w:t>
+      </w:r>
+      <w:proofErr w:type="gramEnd"/>
+      <w:r>
+        <w:t>[</w:t>
+      </w:r>
+      <w:proofErr w:type="spellStart"/>
+      <w:r>
+        <w:rPr>
+          <w:lang w:val="en-US"/>
+        </w:rPr>
+        <w:t>i</w:t>
+      </w:r>
+      <w:proofErr w:type="spellEnd"/>
+      <w:r>
+        <w:t>+1</w:t>
+      </w:r>
+      <w:proofErr w:type="gramStart"/>
+      <w:r>
+        <w:t>].</w:t>
+      </w:r>
+      <w:proofErr w:type="spellStart"/>
+      <w:r>
+        <w:rPr>
+          <w:lang w:val="en-US"/>
+        </w:rPr>
+        <w:t>classidReadable</w:t>
+      </w:r>
+      <w:proofErr w:type="spellEnd"/>
+      <w:proofErr w:type="gramEnd"/>
+      <w:r>
+        <w:t>}</w:t>
+      </w:r>
+    </w:p>
+    <w:p>
+      <w:r>
+        <w:t>{</w:t>
+      </w:r>
+      <w:proofErr w:type="gramStart"/>
+      <w:r>
+        <w:rPr>
+          <w:lang w:val="en-US"/>
+        </w:rPr>
+        <w:t>d</w:t>
+      </w:r>
+      <w:r>
+        <w:t>.</w:t>
+      </w:r>
+      <w:r>
+        <w:rPr>
+          <w:lang w:val="en-US"/>
+        </w:rPr>
+        <w:t>fz</w:t>
+      </w:r>
+      <w:proofErr w:type="gramEnd"/>
+      <w:r>
+        <w:t>:</w:t>
+      </w:r>
+      <w:proofErr w:type="spellStart"/>
+      <w:r>
+        <w:rPr>
+          <w:lang w:val="en-US"/>
+        </w:rPr>
+        <w:t>ifEM</w:t>
+      </w:r>
+      <w:proofErr w:type="spellEnd"/>
+      <w:r>
+        <w:t>(</w:t>
+      </w:r>
+      <w:proofErr w:type="gramStart"/>
+      <w:r>
+        <w:t>):</w:t>
+      </w:r>
+      <w:proofErr w:type="spellStart"/>
+      <w:r>
+        <w:rPr>
+          <w:lang w:val="en-US"/>
+        </w:rPr>
+        <w:t>showBegin</w:t>
+      </w:r>
+      <w:proofErr w:type="spellEnd"/>
+      <w:proofErr w:type="gramEnd"/>
+      <w:r>
+        <w:t>}</w:t>
+      </w:r>
+      <w:r>
+        <w:t>Для объекта не найдена информация о территориальных зонах</w:t>
+      </w:r>
+      <w:r>
+        <w:t>.</w:t>
+      </w:r>
+    </w:p>
+    <w:p/>
+    <w:p>
+      <w:pPr>
+        <w:keepNext/>
+      </w:pPr>
+      <w:r>
+        <w:t>{</w:t>
+      </w:r>
+      <w:proofErr w:type="gramStart"/>
+      <w:r>
+        <w:rPr>
+          <w:lang w:val="en-US"/>
+        </w:rPr>
+        <w:t>d</w:t>
+      </w:r>
+      <w:r>
+        <w:t>.</w:t>
+      </w:r>
+      <w:r>
+        <w:rPr>
+          <w:lang w:val="en-US"/>
+        </w:rPr>
+        <w:t>fz</w:t>
+      </w:r>
+      <w:proofErr w:type="gramEnd"/>
+      <w:r>
+        <w:t>:</w:t>
+      </w:r>
+      <w:proofErr w:type="spellStart"/>
+      <w:proofErr w:type="gramStart"/>
+      <w:r>
+        <w:rPr>
+          <w:lang w:val="en-US"/>
+        </w:rPr>
+        <w:t>showEnd</w:t>
+      </w:r>
+      <w:proofErr w:type="spellEnd"/>
+      <w:r>
+        <w:t>}</w:t>
+      </w:r>
+      <w:r>
+        <w:t>Сведения</w:t>
+      </w:r>
+      <w:proofErr w:type="gramEnd"/>
+      <w:r>
+        <w:t xml:space="preserve">, указанные в данном разделе, являются актуальными на </w:t>
       </w:r>
       <w:r>
         <w:rPr>
@@ -4721,7 +5407,6 @@
   <w:style w:type="character" w:default="1" w:styleId="a0">
     <w:name w:val="Default Paragraph Font"/>
     <w:uiPriority w:val="1"/>
-    <w:semiHidden/>
     <w:unhideWhenUsed/>
   </w:style>
   <w:style w:type="table" w:default="1" w:styleId="a1">

</xml_diff>

<commit_message>
Merged PR 1245: feat(ui:print) warnings on print form
Related work items: #4184, #4200
</commit_message>
<xml_diff>
--- a/report-service/src/main/resources/system_templates/sys_plot_conclusion.docx
+++ b/report-service/src/main/resources/system_templates/sys_plot_conclusion.docx
@@ -2030,6 +2030,64 @@
       </w:pPr>
       <w:r>
         <w:lastRenderedPageBreak/>
+        <w:t>{</w:t>
+      </w:r>
+      <w:proofErr w:type="gramStart"/>
+      <w:r>
+        <w:rPr>
+          <w:lang w:val="en-US"/>
+        </w:rPr>
+        <w:t>d</w:t>
+      </w:r>
+      <w:r>
+        <w:t>.</w:t>
+      </w:r>
+      <w:proofErr w:type="spellStart"/>
+      <w:r>
+        <w:rPr>
+          <w:lang w:val="en-US"/>
+        </w:rPr>
+        <w:t>showOks</w:t>
+      </w:r>
+      <w:proofErr w:type="spellEnd"/>
+      <w:proofErr w:type="gramEnd"/>
+      <w:r>
+        <w:t>:</w:t>
+      </w:r>
+      <w:proofErr w:type="spellStart"/>
+      <w:r>
+        <w:rPr>
+          <w:lang w:val="en-US"/>
+        </w:rPr>
+        <w:t>ifEQ</w:t>
+      </w:r>
+      <w:proofErr w:type="spellEnd"/>
+      <w:r>
+        <w:t>(</w:t>
+      </w:r>
+      <w:r>
+        <w:rPr>
+          <w:lang w:val="en-US"/>
+        </w:rPr>
+        <w:t>true</w:t>
+      </w:r>
+      <w:proofErr w:type="gramStart"/>
+      <w:r>
+        <w:t>):</w:t>
+      </w:r>
+      <w:proofErr w:type="spellStart"/>
+      <w:r>
+        <w:rPr>
+          <w:lang w:val="en-US"/>
+        </w:rPr>
+        <w:t>showBegin</w:t>
+      </w:r>
+      <w:proofErr w:type="spellEnd"/>
+      <w:proofErr w:type="gramEnd"/>
+      <w:r>
+        <w:t>}</w:t>
+      </w:r>
+      <w:r>
         <w:t>Сведения из Единого государственного реестра недвижимости об</w:t>
       </w:r>
       <w:r>
@@ -3017,6 +3075,83 @@
       </w:pPr>
       <w:r>
         <w:lastRenderedPageBreak/>
+        <w:t>{</w:t>
+      </w:r>
+      <w:proofErr w:type="spellStart"/>
+      <w:proofErr w:type="gramStart"/>
+      <w:r>
+        <w:t>d.showOks</w:t>
+      </w:r>
+      <w:proofErr w:type="gramEnd"/>
+      <w:r>
+        <w:t>:</w:t>
+      </w:r>
+      <w:proofErr w:type="gramStart"/>
+      <w:r>
+        <w:t>showEnd</w:t>
+      </w:r>
+      <w:proofErr w:type="spellEnd"/>
+      <w:r>
+        <w:t>}</w:t>
+      </w:r>
+      <w:r>
+        <w:t>{</w:t>
+      </w:r>
+      <w:r>
+        <w:rPr>
+          <w:lang w:val="en-US"/>
+        </w:rPr>
+        <w:t>d</w:t>
+      </w:r>
+      <w:r>
+        <w:t>.</w:t>
+      </w:r>
+      <w:proofErr w:type="spellStart"/>
+      <w:r>
+        <w:rPr>
+          <w:lang w:val="en-US"/>
+        </w:rPr>
+        <w:t>showZouit</w:t>
+      </w:r>
+      <w:proofErr w:type="spellEnd"/>
+      <w:proofErr w:type="gramEnd"/>
+      <w:r>
+        <w:t>:</w:t>
+      </w:r>
+      <w:proofErr w:type="spellStart"/>
+      <w:r>
+        <w:rPr>
+          <w:lang w:val="en-US"/>
+        </w:rPr>
+        <w:t>ifEQ</w:t>
+      </w:r>
+      <w:proofErr w:type="spellEnd"/>
+      <w:r>
+        <w:t>(</w:t>
+      </w:r>
+      <w:r>
+        <w:rPr>
+          <w:lang w:val="en-US"/>
+        </w:rPr>
+        <w:t>true</w:t>
+      </w:r>
+      <w:proofErr w:type="gramStart"/>
+      <w:r>
+        <w:t>):</w:t>
+      </w:r>
+      <w:proofErr w:type="spellStart"/>
+      <w:r>
+        <w:rPr>
+          <w:lang w:val="en-US"/>
+        </w:rPr>
+        <w:t>showBegin</w:t>
+      </w:r>
+      <w:proofErr w:type="spellEnd"/>
+      <w:proofErr w:type="gramEnd"/>
+      <w:r>
+        <w:t>}</w:t>
+      </w:r>
+      <w:r>
         <w:t xml:space="preserve">Сведения из Единого государственного реестра недвижимости </w:t>
       </w:r>
       <w:r>
@@ -4122,6 +4257,59 @@
       </w:pPr>
       <w:r>
         <w:lastRenderedPageBreak/>
+        <w:t>{</w:t>
+      </w:r>
+      <w:proofErr w:type="spellStart"/>
+      <w:proofErr w:type="gramStart"/>
+      <w:r>
+        <w:t>d.showZouit</w:t>
+      </w:r>
+      <w:proofErr w:type="gramEnd"/>
+      <w:r>
+        <w:t>:</w:t>
+      </w:r>
+      <w:proofErr w:type="gramStart"/>
+      <w:r>
+        <w:t>showEnd</w:t>
+      </w:r>
+      <w:proofErr w:type="spellEnd"/>
+      <w:r>
+        <w:t>}</w:t>
+      </w:r>
+      <w:r>
+        <w:t>{</w:t>
+      </w:r>
+      <w:proofErr w:type="spellStart"/>
+      <w:r>
+        <w:t>d.showFz</w:t>
+      </w:r>
+      <w:proofErr w:type="gramEnd"/>
+      <w:r>
+        <w:t>:ifEQ</w:t>
+      </w:r>
+      <w:proofErr w:type="spellEnd"/>
+      <w:r>
+        <w:t>(</w:t>
+      </w:r>
+      <w:proofErr w:type="spellStart"/>
+      <w:r>
+        <w:t>true</w:t>
+      </w:r>
+      <w:proofErr w:type="spellEnd"/>
+      <w:proofErr w:type="gramStart"/>
+      <w:r>
+        <w:t>):</w:t>
+      </w:r>
+      <w:proofErr w:type="spellStart"/>
+      <w:r>
+        <w:t>showBegin</w:t>
+      </w:r>
+      <w:proofErr w:type="spellEnd"/>
+      <w:proofErr w:type="gramEnd"/>
+      <w:r>
+        <w:t>}</w:t>
+      </w:r>
+      <w:r>
         <w:t>Сведения о расположении участка в функциональных зонах</w:t>
       </w:r>
     </w:p>
@@ -4799,7 +4987,744 @@
         <w:t>')}</w:t>
       </w:r>
     </w:p>
+    <w:p>
+      <w:pPr>
+        <w:suppressAutoHyphens/>
+        <w:spacing w:after="0" w:line="240" w:lineRule="auto"/>
+      </w:pPr>
+      <w:r>
+        <w:br w:type="page"/>
+      </w:r>
+    </w:p>
+    <w:p>
+      <w:pPr>
+        <w:pStyle w:val="a4"/>
+      </w:pPr>
+      <w:r>
+        <w:lastRenderedPageBreak/>
+        <w:t>{</w:t>
+      </w:r>
+      <w:proofErr w:type="spellStart"/>
+      <w:proofErr w:type="gramStart"/>
+      <w:r>
+        <w:t>d.</w:t>
+      </w:r>
+      <w:r>
+        <w:t>showFz</w:t>
+      </w:r>
+      <w:proofErr w:type="gramEnd"/>
+      <w:r>
+        <w:t>:</w:t>
+      </w:r>
+      <w:proofErr w:type="gramStart"/>
+      <w:r>
+        <w:t>showEnd</w:t>
+      </w:r>
+      <w:proofErr w:type="spellEnd"/>
+      <w:r>
+        <w:t>}</w:t>
+      </w:r>
+      <w:r>
+        <w:t>{</w:t>
+      </w:r>
+      <w:proofErr w:type="spellStart"/>
+      <w:r>
+        <w:t>d.showNp</w:t>
+      </w:r>
+      <w:proofErr w:type="gramEnd"/>
+      <w:r>
+        <w:t>:ifEQ</w:t>
+      </w:r>
+      <w:proofErr w:type="spellEnd"/>
+      <w:r>
+        <w:t>(</w:t>
+      </w:r>
+      <w:proofErr w:type="spellStart"/>
+      <w:r>
+        <w:t>true</w:t>
+      </w:r>
+      <w:proofErr w:type="spellEnd"/>
+      <w:proofErr w:type="gramStart"/>
+      <w:r>
+        <w:t>):</w:t>
+      </w:r>
+      <w:proofErr w:type="spellStart"/>
+      <w:r>
+        <w:t>showBegin</w:t>
+      </w:r>
+      <w:proofErr w:type="spellEnd"/>
+      <w:proofErr w:type="gramEnd"/>
+      <w:r>
+        <w:t>}</w:t>
+      </w:r>
+      <w:r>
+        <w:t xml:space="preserve">Сведения о расположении участка в </w:t>
+      </w:r>
+      <w:r>
+        <w:t>границах населённого пункта</w:t>
+      </w:r>
+    </w:p>
+    <w:p>
+      <w:pPr>
+        <w:pStyle w:val="a6"/>
+        <w:rPr>
+          <w:lang w:val="en-US"/>
+        </w:rPr>
+      </w:pPr>
+      <w:r>
+        <w:rPr>
+          <w:lang w:val="en-US"/>
+        </w:rPr>
+        <w:t>{</w:t>
+      </w:r>
+      <w:r>
+        <w:rPr>
+          <w:lang w:val="en-US"/>
+        </w:rPr>
+        <w:t>d.</w:t>
+      </w:r>
+      <w:r>
+        <w:rPr>
+          <w:lang w:val="en-US"/>
+        </w:rPr>
+        <w:t>np</w:t>
+      </w:r>
+      <w:r>
+        <w:rPr>
+          <w:lang w:val="en-US"/>
+        </w:rPr>
+        <w:t>[</w:t>
+      </w:r>
+      <w:proofErr w:type="spellStart"/>
+      <w:r>
+        <w:rPr>
+          <w:lang w:val="en-US"/>
+        </w:rPr>
+        <w:t>i</w:t>
+      </w:r>
+      <w:proofErr w:type="spellEnd"/>
+      <w:proofErr w:type="gramStart"/>
+      <w:r>
+        <w:rPr>
+          <w:lang w:val="en-US"/>
+        </w:rPr>
+        <w:t>].</w:t>
+      </w:r>
+      <w:proofErr w:type="spellStart"/>
+      <w:r>
+        <w:rPr>
+          <w:lang w:val="en-US"/>
+        </w:rPr>
+        <w:t>statusAdmReadable</w:t>
+      </w:r>
+      <w:proofErr w:type="gramEnd"/>
+      <w:r>
+        <w:rPr>
+          <w:lang w:val="en-US"/>
+        </w:rPr>
+        <w:t>:print</w:t>
+      </w:r>
+      <w:proofErr w:type="spellEnd"/>
+      <w:proofErr w:type="gramStart"/>
+      <w:r>
+        <w:rPr>
+          <w:lang w:val="en-US"/>
+        </w:rPr>
+        <w:t>(.</w:t>
+      </w:r>
+      <w:proofErr w:type="spellStart"/>
+      <w:r>
+        <w:rPr>
+          <w:lang w:val="en-US"/>
+        </w:rPr>
+        <w:t>i</w:t>
+      </w:r>
+      <w:proofErr w:type="spellEnd"/>
+      <w:r>
+        <w:rPr>
+          <w:lang w:val="en-US"/>
+        </w:rPr>
+        <w:t>):add</w:t>
+      </w:r>
+      <w:proofErr w:type="gramEnd"/>
+      <w:r>
+        <w:rPr>
+          <w:lang w:val="en-US"/>
+        </w:rPr>
+        <w:t>(1)</w:t>
+      </w:r>
+      <w:r>
+        <w:rPr>
+          <w:lang w:val="en-US"/>
+        </w:rPr>
+        <w:t>}. {</w:t>
+      </w:r>
+      <w:r>
+        <w:rPr>
+          <w:lang w:val="en-US"/>
+        </w:rPr>
+        <w:t>d.</w:t>
+      </w:r>
+      <w:r>
+        <w:rPr>
+          <w:lang w:val="en-US"/>
+        </w:rPr>
+        <w:t>np</w:t>
+      </w:r>
+      <w:r>
+        <w:rPr>
+          <w:lang w:val="en-US"/>
+        </w:rPr>
+        <w:t>[</w:t>
+      </w:r>
+      <w:proofErr w:type="spellStart"/>
+      <w:r>
+        <w:rPr>
+          <w:lang w:val="en-US"/>
+        </w:rPr>
+        <w:t>i</w:t>
+      </w:r>
+      <w:proofErr w:type="spellEnd"/>
+      <w:proofErr w:type="gramStart"/>
+      <w:r>
+        <w:rPr>
+          <w:lang w:val="en-US"/>
+        </w:rPr>
+        <w:t>]</w:t>
+      </w:r>
+      <w:r>
+        <w:rPr>
+          <w:lang w:val="en-US"/>
+        </w:rPr>
+        <w:t>.feature.properties</w:t>
+      </w:r>
+      <w:r>
+        <w:rPr>
+          <w:lang w:val="en-US"/>
+        </w:rPr>
+        <w:t>.</w:t>
+      </w:r>
+      <w:r>
+        <w:rPr>
+          <w:lang w:val="en-US"/>
+        </w:rPr>
+        <w:t>name</w:t>
+      </w:r>
+      <w:proofErr w:type="gramEnd"/>
+      <w:r>
+        <w:rPr>
+          <w:lang w:val="en-US"/>
+        </w:rPr>
+        <w:t>}</w:t>
+      </w:r>
+    </w:p>
+    <w:tbl>
+      <w:tblPr>
+        <w:tblStyle w:val="geo"/>
+        <w:tblW w:w="5000" w:type="pct"/>
+        <w:shd w:val="clear" w:color="auto" w:fill="FFFFFF"/>
+        <w:tblLayout w:type="fixed"/>
+        <w:tblCellMar>
+          <w:left w:w="113" w:type="dxa"/>
+          <w:right w:w="113" w:type="dxa"/>
+        </w:tblCellMar>
+        <w:tblLook w:val="0680" w:firstRow="0" w:lastRow="0" w:firstColumn="1" w:lastColumn="0" w:noHBand="1" w:noVBand="1"/>
+      </w:tblPr>
+      <w:tblGrid>
+        <w:gridCol w:w="5224"/>
+        <w:gridCol w:w="5031"/>
+      </w:tblGrid>
+      <w:tr>
+        <w:tc>
+          <w:tcPr>
+            <w:cnfStyle w:val="001000000000" w:firstRow="0" w:lastRow="0" w:firstColumn="1" w:lastColumn="0" w:oddVBand="0" w:evenVBand="0" w:oddHBand="0" w:evenHBand="0" w:firstRowFirstColumn="0" w:firstRowLastColumn="0" w:lastRowFirstColumn="0" w:lastRowLastColumn="0"/>
+            <w:tcW w:w="5224" w:type="dxa"/>
+          </w:tcPr>
+          <w:p>
+            <w:pPr>
+              <w:rPr>
+                <w:rStyle w:val="af4"/>
+              </w:rPr>
+            </w:pPr>
+            <w:r>
+              <w:rPr>
+                <w:rStyle w:val="af4"/>
+              </w:rPr>
+              <w:t>Статус</w:t>
+            </w:r>
+          </w:p>
+        </w:tc>
+        <w:tc>
+          <w:tcPr>
+            <w:tcW w:w="5031" w:type="dxa"/>
+          </w:tcPr>
+          <w:p>
+            <w:pPr>
+              <w:cnfStyle w:val="000000000000" w:firstRow="0" w:lastRow="0" w:firstColumn="0" w:lastColumn="0" w:oddVBand="0" w:evenVBand="0" w:oddHBand="0" w:evenHBand="0" w:firstRowFirstColumn="0" w:firstRowLastColumn="0" w:lastRowFirstColumn="0" w:lastRowLastColumn="0"/>
+              <w:rPr>
+                <w:lang w:val="en-US"/>
+              </w:rPr>
+            </w:pPr>
+            <w:r>
+              <w:rPr>
+                <w:lang w:val="en-US"/>
+              </w:rPr>
+              <w:t>{d.</w:t>
+            </w:r>
+            <w:r>
+              <w:rPr>
+                <w:lang w:val="en-US"/>
+              </w:rPr>
+              <w:t>np</w:t>
+            </w:r>
+            <w:r>
+              <w:rPr>
+                <w:lang w:val="en-US"/>
+              </w:rPr>
+              <w:t>[</w:t>
+            </w:r>
+            <w:proofErr w:type="spellStart"/>
+            <w:r>
+              <w:rPr>
+                <w:lang w:val="en-US"/>
+              </w:rPr>
+              <w:t>i</w:t>
+            </w:r>
+            <w:proofErr w:type="spellEnd"/>
+            <w:proofErr w:type="gramStart"/>
+            <w:r>
+              <w:rPr>
+                <w:lang w:val="en-US"/>
+              </w:rPr>
+              <w:t>].</w:t>
+            </w:r>
+            <w:proofErr w:type="spellStart"/>
+            <w:r>
+              <w:rPr>
+                <w:lang w:val="en-US"/>
+              </w:rPr>
+              <w:t>statusAdmReadable</w:t>
+            </w:r>
+            <w:proofErr w:type="spellEnd"/>
+            <w:proofErr w:type="gramEnd"/>
+            <w:r>
+              <w:rPr>
+                <w:lang w:val="en-US"/>
+              </w:rPr>
+              <w:t>}</w:t>
+            </w:r>
+          </w:p>
+        </w:tc>
+      </w:tr>
+      <w:tr>
+        <w:tc>
+          <w:tcPr>
+            <w:cnfStyle w:val="001000000000" w:firstRow="0" w:lastRow="0" w:firstColumn="1" w:lastColumn="0" w:oddVBand="0" w:evenVBand="0" w:oddHBand="0" w:evenHBand="0" w:firstRowFirstColumn="0" w:firstRowLastColumn="0" w:lastRowFirstColumn="0" w:lastRowLastColumn="0"/>
+            <w:tcW w:w="5224" w:type="dxa"/>
+          </w:tcPr>
+          <w:p>
+            <w:pPr>
+              <w:rPr>
+                <w:rStyle w:val="af4"/>
+              </w:rPr>
+            </w:pPr>
+            <w:r>
+              <w:rPr>
+                <w:rStyle w:val="af4"/>
+              </w:rPr>
+              <w:t>Площадь пересечения с объектом недвижимости</w:t>
+            </w:r>
+          </w:p>
+        </w:tc>
+        <w:tc>
+          <w:tcPr>
+            <w:tcW w:w="5031" w:type="dxa"/>
+          </w:tcPr>
+          <w:p>
+            <w:pPr>
+              <w:cnfStyle w:val="000000000000" w:firstRow="0" w:lastRow="0" w:firstColumn="0" w:lastColumn="0" w:oddVBand="0" w:evenVBand="0" w:oddHBand="0" w:evenHBand="0" w:firstRowFirstColumn="0" w:firstRowLastColumn="0" w:lastRowFirstColumn="0" w:lastRowLastColumn="0"/>
+              <w:rPr>
+                <w:noProof/>
+                <w:lang w:val="en-US"/>
+              </w:rPr>
+            </w:pPr>
+            <w:r>
+              <w:rPr>
+                <w:noProof/>
+                <w:lang w:val="en-US"/>
+              </w:rPr>
+              <w:t>{d.</w:t>
+            </w:r>
+            <w:r>
+              <w:rPr>
+                <w:lang w:val="en-US"/>
+              </w:rPr>
+              <w:t>np</w:t>
+            </w:r>
+            <w:r>
+              <w:rPr>
+                <w:noProof/>
+                <w:lang w:val="en-US"/>
+              </w:rPr>
+              <w:t>[</w:t>
+            </w:r>
+            <w:proofErr w:type="spellStart"/>
+            <w:r>
+              <w:rPr>
+                <w:noProof/>
+                <w:lang w:val="en-US"/>
+              </w:rPr>
+              <w:t>i</w:t>
+            </w:r>
+            <w:proofErr w:type="spellEnd"/>
+            <w:r>
+              <w:rPr>
+                <w:noProof/>
+                <w:lang w:val="en-US"/>
+              </w:rPr>
+              <w:t>].</w:t>
+            </w:r>
+            <w:r>
+              <w:rPr>
+                <w:noProof/>
+                <w:lang w:val="en-US"/>
+              </w:rPr>
+              <w:t>intersectionArea</w:t>
+            </w:r>
+            <w:r>
+              <w:rPr>
+                <w:noProof/>
+                <w:lang w:val="en-US"/>
+              </w:rPr>
+              <w:t>}</w:t>
+            </w:r>
+            <w:r>
+              <w:rPr>
+                <w:noProof/>
+                <w:lang w:val="en-US"/>
+              </w:rPr>
+              <w:t xml:space="preserve"> </w:t>
+            </w:r>
+            <w:r>
+              <w:rPr>
+                <w:noProof/>
+              </w:rPr>
+              <w:t>м</w:t>
+            </w:r>
+            <w:r>
+              <w:rPr>
+                <w:noProof/>
+                <w:vertAlign w:val="superscript"/>
+                <w:lang w:val="en-US"/>
+              </w:rPr>
+              <w:t>2</w:t>
+            </w:r>
+            <w:r>
+              <w:rPr>
+                <w:noProof/>
+                <w:lang w:val="en-US"/>
+              </w:rPr>
+              <w:t xml:space="preserve"> (</w:t>
+            </w:r>
+            <w:r>
+              <w:rPr>
+                <w:noProof/>
+                <w:lang w:val="en-US"/>
+              </w:rPr>
+              <w:t>{</w:t>
+            </w:r>
+            <w:r>
+              <w:rPr>
+                <w:noProof/>
+                <w:lang w:val="en-US"/>
+              </w:rPr>
+              <w:t>d.</w:t>
+            </w:r>
+            <w:r>
+              <w:rPr>
+                <w:lang w:val="en-US"/>
+              </w:rPr>
+              <w:t>np</w:t>
+            </w:r>
+            <w:r>
+              <w:rPr>
+                <w:noProof/>
+                <w:lang w:val="en-US"/>
+              </w:rPr>
+              <w:t>[</w:t>
+            </w:r>
+            <w:proofErr w:type="spellStart"/>
+            <w:r>
+              <w:rPr>
+                <w:noProof/>
+                <w:lang w:val="en-US"/>
+              </w:rPr>
+              <w:t>i</w:t>
+            </w:r>
+            <w:proofErr w:type="spellEnd"/>
+            <w:r>
+              <w:rPr>
+                <w:noProof/>
+                <w:lang w:val="en-US"/>
+              </w:rPr>
+              <w:t>].</w:t>
+            </w:r>
+            <w:r>
+              <w:rPr>
+                <w:noProof/>
+                <w:lang w:val="en-US"/>
+              </w:rPr>
+              <w:t>intersectionAreaPercent</w:t>
+            </w:r>
+            <w:r>
+              <w:rPr>
+                <w:noProof/>
+                <w:lang w:val="en-US"/>
+              </w:rPr>
+              <w:t>}</w:t>
+            </w:r>
+            <w:r>
+              <w:rPr>
+                <w:noProof/>
+                <w:lang w:val="en-US"/>
+              </w:rPr>
+              <w:t>%)</w:t>
+            </w:r>
+          </w:p>
+        </w:tc>
+      </w:tr>
+    </w:tbl>
+    <w:p>
+      <w:pPr>
+        <w:pStyle w:val="a6"/>
+      </w:pPr>
+      <w:r>
+        <w:t>{</w:t>
+      </w:r>
+      <w:r>
+        <w:rPr>
+          <w:lang w:val="en-US"/>
+        </w:rPr>
+        <w:t>d</w:t>
+      </w:r>
+      <w:r>
+        <w:t>.</w:t>
+      </w:r>
+      <w:r>
+        <w:rPr>
+          <w:lang w:val="en-US"/>
+        </w:rPr>
+        <w:t>np</w:t>
+      </w:r>
+      <w:r>
+        <w:t>[</w:t>
+      </w:r>
+      <w:proofErr w:type="spellStart"/>
+      <w:r>
+        <w:rPr>
+          <w:lang w:val="en-US"/>
+        </w:rPr>
+        <w:t>i</w:t>
+      </w:r>
+      <w:proofErr w:type="spellEnd"/>
+      <w:r>
+        <w:t>+1</w:t>
+      </w:r>
+      <w:proofErr w:type="gramStart"/>
+      <w:r>
+        <w:t>].</w:t>
+      </w:r>
+      <w:proofErr w:type="spellStart"/>
+      <w:r>
+        <w:rPr>
+          <w:lang w:val="en-US"/>
+        </w:rPr>
+        <w:t>statusAdmReadable</w:t>
+      </w:r>
+      <w:proofErr w:type="spellEnd"/>
+      <w:proofErr w:type="gramEnd"/>
+      <w:r>
+        <w:t>}</w:t>
+      </w:r>
+    </w:p>
     <w:p/>
+    <w:p>
+      <w:r>
+        <w:t>{</w:t>
+      </w:r>
+      <w:r>
+        <w:rPr>
+          <w:lang w:val="en-US"/>
+        </w:rPr>
+        <w:t>d</w:t>
+      </w:r>
+      <w:r>
+        <w:t>.</w:t>
+      </w:r>
+      <w:proofErr w:type="gramStart"/>
+      <w:r>
+        <w:rPr>
+          <w:lang w:val="en-US"/>
+        </w:rPr>
+        <w:t>np</w:t>
+      </w:r>
+      <w:r>
+        <w:t>:</w:t>
+      </w:r>
+      <w:proofErr w:type="spellStart"/>
+      <w:r>
+        <w:rPr>
+          <w:lang w:val="en-US"/>
+        </w:rPr>
+        <w:t>ifEM</w:t>
+      </w:r>
+      <w:proofErr w:type="spellEnd"/>
+      <w:proofErr w:type="gramEnd"/>
+      <w:r>
+        <w:t>(</w:t>
+      </w:r>
+      <w:proofErr w:type="gramStart"/>
+      <w:r>
+        <w:t>):</w:t>
+      </w:r>
+      <w:proofErr w:type="spellStart"/>
+      <w:r>
+        <w:rPr>
+          <w:lang w:val="en-US"/>
+        </w:rPr>
+        <w:t>showBegin</w:t>
+      </w:r>
+      <w:proofErr w:type="spellEnd"/>
+      <w:proofErr w:type="gramEnd"/>
+      <w:r>
+        <w:t>}</w:t>
+      </w:r>
+      <w:r>
+        <w:t xml:space="preserve">Для объекта не найдена информация о </w:t>
+      </w:r>
+      <w:r>
+        <w:t>границах населённого пункта.</w:t>
+      </w:r>
+    </w:p>
+    <w:p/>
+    <w:p>
+      <w:pPr>
+        <w:keepNext/>
+      </w:pPr>
+      <w:r>
+        <w:t>{</w:t>
+      </w:r>
+      <w:r>
+        <w:rPr>
+          <w:lang w:val="en-US"/>
+        </w:rPr>
+        <w:t>d</w:t>
+      </w:r>
+      <w:r>
+        <w:t>.</w:t>
+      </w:r>
+      <w:proofErr w:type="gramStart"/>
+      <w:r>
+        <w:rPr>
+          <w:lang w:val="en-US"/>
+        </w:rPr>
+        <w:t>np</w:t>
+      </w:r>
+      <w:r>
+        <w:t>:</w:t>
+      </w:r>
+      <w:proofErr w:type="spellStart"/>
+      <w:r>
+        <w:rPr>
+          <w:lang w:val="en-US"/>
+        </w:rPr>
+        <w:t>showEnd</w:t>
+      </w:r>
+      <w:proofErr w:type="spellEnd"/>
+      <w:proofErr w:type="gramEnd"/>
+      <w:r>
+        <w:t>}</w:t>
+      </w:r>
+      <w:r>
+        <w:t xml:space="preserve">Сведения, указанные в данном разделе, являются актуальными на </w:t>
+      </w:r>
+      <w:r>
+        <w:rPr>
+          <w:noProof/>
+        </w:rPr>
+        <w:t>{</w:t>
+      </w:r>
+      <w:r>
+        <w:rPr>
+          <w:noProof/>
+          <w:lang w:val="en-US"/>
+        </w:rPr>
+        <w:t>d</w:t>
+      </w:r>
+      <w:r>
+        <w:rPr>
+          <w:noProof/>
+        </w:rPr>
+        <w:t>.</w:t>
+      </w:r>
+      <w:r>
+        <w:rPr>
+          <w:noProof/>
+          <w:lang w:val="en-US"/>
+        </w:rPr>
+        <w:t>dataDate</w:t>
+      </w:r>
+      <w:r>
+        <w:rPr>
+          <w:noProof/>
+        </w:rPr>
+        <w:t>:</w:t>
+      </w:r>
+      <w:r>
+        <w:rPr>
+          <w:noProof/>
+          <w:lang w:val="en-US"/>
+        </w:rPr>
+        <w:t>formatD</w:t>
+      </w:r>
+      <w:r>
+        <w:rPr>
+          <w:noProof/>
+        </w:rPr>
+        <w:t>('</w:t>
+      </w:r>
+      <w:r>
+        <w:rPr>
+          <w:noProof/>
+          <w:lang w:val="en-US"/>
+        </w:rPr>
+        <w:t>LL</w:t>
+      </w:r>
+      <w:r>
+        <w:rPr>
+          <w:noProof/>
+        </w:rPr>
+        <w:t>')}</w:t>
+      </w:r>
+    </w:p>
+    <w:p>
+      <w:r>
+        <w:t>{</w:t>
+      </w:r>
+      <w:proofErr w:type="spellStart"/>
+      <w:proofErr w:type="gramStart"/>
+      <w:r>
+        <w:t>d.showNp</w:t>
+      </w:r>
+      <w:proofErr w:type="gramEnd"/>
+      <w:r>
+        <w:t>:showEnd</w:t>
+      </w:r>
+      <w:proofErr w:type="spellEnd"/>
+      <w:r>
+        <w:t>}</w:t>
+      </w:r>
+    </w:p>
     <w:sectPr>
       <w:type w:val="continuous"/>
       <w:pgSz w:w="12240" w:h="15840"/>

</xml_diff>